<commit_message>
Rebuild the Software Validation transcript from the final revision
The Part Four slice finished revising after the document was first
assembled, so slides 47 to 50 were one draft behind. No content change
beyond that slice's own trim.

Co-Authored-By: Claude Opus 5 <noreply@anthropic.com>
Claude-Session: https://claude.ai/code/session_01FPYtZB6P1JoD1JsvRRZGPF
</commit_message>
<xml_diff>
--- a/seminars/software-validation-cybersecurity/Speaker_Transcript.docx
+++ b/seminars/software-validation-cybersecurity/Speaker_Transcript.docx
@@ -2743,7 +2743,7 @@
           <w:i w:val="0"/>
           <w:sz w:val="24"/>
         </w:rPr>
-        <w:t>The most common organisational failure here is not technical at all. Most companies have a quality function that owns validation and a security function, often newer, smaller and sometimes borrowed from the information technology group, that owns cybersecurity; they produce parallel documentation, hold separate reviews, and meet properly for the first time during a submission or an incident. That is expensive, it produces contradictions that a reviewer will find, and it leaves the interfaces between them unowned. The right-hand column of this table is where the two must meet:</w:t>
+        <w:t>The most common organisational failure here is not technical at all. Most companies have a quality function that owns validation and a security function, often newer, smaller and sometimes borrowed from the information technology group, that owns cybersecurity; they produce parallel documentation, hold separate reviews, and meet properly for the first time during a submission or an incident. That is expensive, it produces contradictions that a reviewer will find, and it leaves the interfaces unowned. The right-hand column of this table is where the two must meet:</w:t>
       </w:r>
     </w:p>
     <w:p>
@@ -2822,7 +2822,7 @@
           <w:i w:val="0"/>
           <w:sz w:val="24"/>
         </w:rPr>
-        <w:t>With the integrated lifecycle in front of us, the question is where you begin on Monday. The plan is a worksheet in your workbook, with space for owners and dates, so rather than read it I will say what comes first. The cyber device determination takes an afternoon and settles whether section 524B applies to you; a published security contact is the highest value per hour item here, since a monitored mailbox is days of work and changes what happens when a researcher finds you; and naming an owner for vulnerability monitoring matters more than it sounds, because everyone being responsible means nobody checks on Saturday. I would also ask you to rehearse the emergency patch path before you need it, because an untested process is an assumption rather than a capability, and the last thirty days are about systematisation, which is why the security architecture views belong in your design template.</w:t>
+        <w:t>With the integrated lifecycle in front of us, the question is where you begin on Monday. The plan is a worksheet in your workbook, with space for owners and dates, so rather than read it I will say what comes first. The cyber device determination takes an afternoon and settles whether section 524B applies to you; a published security contact is the highest value per hour item, since a monitored mailbox is days of work and changes what happens when a researcher finds you; and naming an owner for vulnerability monitoring matters more than it sounds, because everyone being responsible means nobody checks on Saturday. I would also ask you to rehearse the emergency patch path before you need it, because an untested process is an assumption rather than a capability, and the last thirty days are about systematisation, which is why the security architecture views belong in your design template.</w:t>
       </w:r>
     </w:p>
     <w:p>
@@ -2849,7 +2849,7 @@
           <w:i w:val="0"/>
           <w:sz w:val="24"/>
         </w:rPr>
-        <w:t>I would ask you to take twenty seconds to read these five levels and then to place your own organisation on the scale twice, quietly, to yourself: once for validation and once for security. The useful number is not either level but the gap between them: organisations building devices for decades are frequently level three or four on validation and level one or two on security, because the validation system is mature and the security function is five years old, whereas newer digital health companies are often the reverse. That asymmetry matters because the remedy differs: if you are strong on validation and weak on security you do not need a new system but an extension of the one you have, and the integration table on slide 47 is your map. Levels one to three are decisions rather than capital, so nobody needs to wait for a budget cycle before moving.</w:t>
+        <w:t>I would ask you to take twenty seconds to read these five levels and then to place your own organisation on the scale twice, quietly and to yourself: once for validation and once for security. The useful number is not either level but the gap between them: organisations building devices for decades are frequently level three or four on validation and level one or two on security, because the validation system is mature and the security function is five years old, whereas newer digital health companies are often the reverse. That asymmetry matters because the remedy differs: if you are strong on validation and weak on security you do not need a new system but an extension of the one you have, and the integration table on slide 47 is your map. Levels one to three are decisions rather than capital, so nobody needs to wait for a budget cycle.</w:t>
       </w:r>
     </w:p>
     <w:p>
@@ -2876,7 +2876,7 @@
           <w:i w:val="0"/>
           <w:sz w:val="24"/>
         </w:rPr>
-        <w:t>Five things are worth remembering, because these are the ones you will repeat to colleagues:</w:t>
+        <w:t>Five things are worth remembering, because these are what you will repeat to colleagues:</w:t>
       </w:r>
     </w:p>
     <w:p>
@@ -2889,7 +2889,7 @@
           <w:i w:val="0"/>
           <w:sz w:val="24"/>
         </w:rPr>
-        <w:t>The first is that security is a safety property rather than an information technology concern: if an attacker can make your device harm a patient, that is a hazardous situation and it belongs in your risk management file, though the two processes remain distinct and it is the findings that must connect.</w:t>
+        <w:t>The first is that security is a safety property rather than an information technology concern: if an attacker can make your device harm a patient, that is a hazardous situation and belongs in your risk management file, though the two processes remain distinct and it is the findings that must connect.</w:t>
       </w:r>
     </w:p>
     <w:p>
@@ -2902,7 +2902,7 @@
           <w:i w:val="0"/>
           <w:sz w:val="24"/>
         </w:rPr>
-        <w:t>The second is that these are now lifecycle obligations, since section 524B, predetermined change control plans and the maintenance expectations in the software guidance all move the question from whether the device was right at release to whether you can keep it right. Every development we have discussed today pushes in that direction, so this is one shift rather than five separate burdens, and an organisation that understands it can meet all of them with one investment.</w:t>
+        <w:t>The second is that these are now lifecycle obligations, since section 524B, predetermined change control plans and the maintenance expectations in the software guidance all move the question from whether the device was right at release to whether you can keep it right. Every development we have discussed today pushes in that direction, so this is one shift rather than five separate burdens, and an organisation that understands it can meet them all with one investment.</w:t>
       </w:r>
     </w:p>
     <w:p>
@@ -2915,7 +2915,7 @@
           <w:i w:val="0"/>
           <w:sz w:val="24"/>
         </w:rPr>
-        <w:t>The third is that you cannot manage what you have not inventoried: the SOUP list, the SBOM, the deployed fleet and the support horizons of the components inside it, since almost every hard problem in this seminar begins with not knowing what you have.</w:t>
+        <w:t>The third is that you cannot manage what you have not inventoried: the SOUP list, the SBOM, the deployed fleet and the support horizons of the components inside it, since almost every hard problem this morning began with not knowing what you have.</w:t>
       </w:r>
     </w:p>
     <w:p>
@@ -2928,7 +2928,7 @@
           <w:i w:val="0"/>
           <w:sz w:val="24"/>
         </w:rPr>
-        <w:t>The fourth is that updateability is the highest-leverage design decision you will make, because every other control defends against threats you have thought of, whereas the ability to ship a fix defends against the ones you have not, which is the difference between a patch and a recall. Both the insulin pump case and this morning's exercise turned on it.</w:t>
+        <w:t>The fourth is that updateability is the highest-leverage design decision you will make, because every other control defends against threats you have thought of, whereas the ability to ship a fix defends against the ones you have not, which is the difference between a patch and a recall, and both the insulin pump case and this morning's exercise turned on that point.</w:t>
       </w:r>
     </w:p>
     <w:p>
@@ -2941,7 +2941,7 @@
           <w:i w:val="0"/>
           <w:sz w:val="24"/>
         </w:rPr>
-        <w:t>The fifth is that you integrate the two programmes or you pay for them twice: one requirements specification, one traceability matrix, one intake queue and one change process, because parallel programmes cost more to run and leave the interfaces between them unowned.</w:t>
+        <w:t>The fifth is that you integrate the two programmes or you pay for them twice: one requirements specification, one traceability matrix, one intake queue and one change process, because parallel programmes cost more and leave the interfaces between them unowned.</w:t>
       </w:r>
     </w:p>
     <w:p>

</xml_diff>